<commit_message>
fix: date Paris, le + noms fichiers lisibles au lieu d'IDs hex
- Template .docx: ajout 'Paris, le {{DATE}}' entre entreprise et destinataire
- Lettres .md: format 'Paris, le JJ/MM/AAAA' au lieu de date brute
- Noms fichiers: mistral-ai_head-of-ai-strategy.docx au lieu de 209KCYN.docx
  * Format: {entreprise-slug}_{titre-slug}.docx (ou .md)
  * Fallback sur safe_id hex si entreprise/titre vides
- _save_letter_md() recoit maintenant city depuis config
</commit_message>
<xml_diff>
--- a/templates/lettre_template.docx
+++ b/templates/lettre_template.docx
@@ -23,6 +23,13 @@
           <w:lang w:val="fr-FR"/>
         </w:rPr>
       </w:pPr>
+      <w:r/>
+      <w:r>
+        <w:rPr>
+          <w:sz w:val="22"/>
+        </w:rPr>
+        <w:t>Paris, le {{DATE}}</w:t>
+      </w:r>
     </w:p>
     <w:p>
       <w:pPr>

</xml_diff>